<commit_message>
Add requirements appendix to the proposal
Co-Authored-By: Claude Opus 5.5 (1M context) <noreply@anthropic.com>
</commit_message>
<xml_diff>
--- a/docs/КП Alux.kz.docx
+++ b/docs/КП Alux.kz.docx
@@ -123,6 +123,7 @@
     <w:p>
       <w:pPr>
         <w:pStyle w:val="Heading1"/>
+        <w:keepNext/>
         <w:pBdr>
           <w:bottom w:val="single" w:color="B8862B" w:sz="6" w:space="4"/>
         </w:pBdr>
@@ -173,6 +174,7 @@
     <w:p>
       <w:pPr>
         <w:pStyle w:val="Heading1"/>
+        <w:keepNext/>
         <w:pBdr>
           <w:bottom w:val="single" w:color="B8862B" w:sz="6" w:space="4"/>
         </w:pBdr>
@@ -193,6 +195,7 @@
     <w:p>
       <w:pPr>
         <w:pStyle w:val="Heading2"/>
+        <w:keepNext/>
         <w:spacing w:after="100" w:before="240"/>
       </w:pPr>
       <w:r>
@@ -378,6 +381,7 @@
     <w:p>
       <w:pPr>
         <w:pStyle w:val="Heading2"/>
+        <w:keepNext/>
         <w:spacing w:after="100" w:before="240"/>
       </w:pPr>
       <w:r>
@@ -467,6 +471,7 @@
     <w:p>
       <w:pPr>
         <w:pStyle w:val="Heading2"/>
+        <w:keepNext/>
         <w:spacing w:after="100" w:before="240"/>
       </w:pPr>
       <w:r>
@@ -556,6 +561,7 @@
     <w:p>
       <w:pPr>
         <w:pStyle w:val="Heading2"/>
+        <w:keepNext/>
         <w:spacing w:after="100" w:before="240"/>
       </w:pPr>
       <w:r>
@@ -669,6 +675,7 @@
     <w:p>
       <w:pPr>
         <w:pStyle w:val="Heading1"/>
+        <w:keepNext/>
         <w:pBdr>
           <w:bottom w:val="single" w:color="B8862B" w:sz="6" w:space="4"/>
         </w:pBdr>
@@ -705,6 +712,7 @@
       </w:tblGrid>
       <w:tr>
         <w:trPr>
+          <w:cantSplit/>
           <w:tblHeader/>
         </w:trPr>
         <w:tc>
@@ -814,6 +822,9 @@
         </w:tc>
       </w:tr>
       <w:tr>
+        <w:trPr>
+          <w:cantSplit/>
+        </w:trPr>
         <w:tc>
           <w:tcPr>
             <w:tcW w:type="dxa" w:w="2600"/>
@@ -918,6 +929,9 @@
         </w:tc>
       </w:tr>
       <w:tr>
+        <w:trPr>
+          <w:cantSplit/>
+        </w:trPr>
         <w:tc>
           <w:tcPr>
             <w:tcW w:type="dxa" w:w="2600"/>
@@ -1025,6 +1039,9 @@
         </w:tc>
       </w:tr>
       <w:tr>
+        <w:trPr>
+          <w:cantSplit/>
+        </w:trPr>
         <w:tc>
           <w:tcPr>
             <w:tcW w:type="dxa" w:w="2600"/>
@@ -1129,6 +1146,9 @@
         </w:tc>
       </w:tr>
       <w:tr>
+        <w:trPr>
+          <w:cantSplit/>
+        </w:trPr>
         <w:tc>
           <w:tcPr>
             <w:tcW w:type="dxa" w:w="2600"/>
@@ -1236,6 +1256,9 @@
         </w:tc>
       </w:tr>
       <w:tr>
+        <w:trPr>
+          <w:cantSplit/>
+        </w:trPr>
         <w:tc>
           <w:tcPr>
             <w:tcW w:type="dxa" w:w="2600"/>
@@ -1340,6 +1363,9 @@
         </w:tc>
       </w:tr>
       <w:tr>
+        <w:trPr>
+          <w:cantSplit/>
+        </w:trPr>
         <w:tc>
           <w:tcPr>
             <w:tcW w:type="dxa" w:w="2600"/>
@@ -1471,6 +1497,7 @@
     <w:p>
       <w:pPr>
         <w:pStyle w:val="Heading1"/>
+        <w:keepNext/>
         <w:pBdr>
           <w:bottom w:val="single" w:color="B8862B" w:sz="6" w:space="4"/>
         </w:pBdr>
@@ -1506,6 +1533,7 @@
       </w:tblGrid>
       <w:tr>
         <w:trPr>
+          <w:cantSplit/>
           <w:tblHeader/>
         </w:trPr>
         <w:tc>
@@ -1580,6 +1608,9 @@
         </w:tc>
       </w:tr>
       <w:tr>
+        <w:trPr>
+          <w:cantSplit/>
+        </w:trPr>
         <w:tc>
           <w:tcPr>
             <w:tcW w:type="dxa" w:w="7038"/>
@@ -1650,6 +1681,9 @@
         </w:tc>
       </w:tr>
       <w:tr>
+        <w:trPr>
+          <w:cantSplit/>
+        </w:trPr>
         <w:tc>
           <w:tcPr>
             <w:tcW w:type="dxa" w:w="7038"/>
@@ -1722,6 +1756,9 @@
         </w:tc>
       </w:tr>
       <w:tr>
+        <w:trPr>
+          <w:cantSplit/>
+        </w:trPr>
         <w:tc>
           <w:tcPr>
             <w:tcW w:type="dxa" w:w="7038"/>
@@ -1792,6 +1829,9 @@
         </w:tc>
       </w:tr>
       <w:tr>
+        <w:trPr>
+          <w:cantSplit/>
+        </w:trPr>
         <w:tc>
           <w:tcPr>
             <w:tcW w:type="dxa" w:w="7038"/>
@@ -1864,6 +1904,9 @@
         </w:tc>
       </w:tr>
       <w:tr>
+        <w:trPr>
+          <w:cantSplit/>
+        </w:trPr>
         <w:tc>
           <w:tcPr>
             <w:tcW w:type="dxa" w:w="7038"/>
@@ -1963,6 +2006,7 @@
     <w:p>
       <w:pPr>
         <w:pStyle w:val="Heading2"/>
+        <w:keepNext/>
         <w:spacing w:after="100" w:before="240"/>
       </w:pPr>
       <w:r>
@@ -1995,6 +2039,7 @@
       </w:tblGrid>
       <w:tr>
         <w:trPr>
+          <w:cantSplit/>
           <w:tblHeader/>
         </w:trPr>
         <w:tc>
@@ -2069,6 +2114,9 @@
         </w:tc>
       </w:tr>
       <w:tr>
+        <w:trPr>
+          <w:cantSplit/>
+        </w:trPr>
         <w:tc>
           <w:tcPr>
             <w:tcW w:type="dxa" w:w="5238"/>
@@ -2139,6 +2187,9 @@
         </w:tc>
       </w:tr>
       <w:tr>
+        <w:trPr>
+          <w:cantSplit/>
+        </w:trPr>
         <w:tc>
           <w:tcPr>
             <w:tcW w:type="dxa" w:w="5238"/>
@@ -2211,6 +2262,9 @@
         </w:tc>
       </w:tr>
       <w:tr>
+        <w:trPr>
+          <w:cantSplit/>
+        </w:trPr>
         <w:tc>
           <w:tcPr>
             <w:tcW w:type="dxa" w:w="5238"/>
@@ -2284,6 +2338,7 @@
     <w:p>
       <w:pPr>
         <w:pStyle w:val="Heading2"/>
+        <w:keepNext/>
         <w:spacing w:after="100" w:before="240"/>
       </w:pPr>
       <w:r>
@@ -2365,6 +2420,7 @@
     <w:p>
       <w:pPr>
         <w:pStyle w:val="Heading1"/>
+        <w:keepNext/>
         <w:pBdr>
           <w:bottom w:val="single" w:color="B8862B" w:sz="6" w:space="4"/>
         </w:pBdr>
@@ -2491,6 +2547,2160 @@
                 <w:szCs w:val="22"/>
               </w:rPr>
               <w:t xml:space="preserve">пришлите материалы по списку требований — и через 3 недели сайт начнёт приносить заявки.</w:t>
+            </w:r>
+          </w:p>
+        </w:tc>
+      </w:tr>
+    </w:tbl>
+    <w:p>
+      <w:r>
+        <w:br w:type="page"/>
+      </w:r>
+    </w:p>
+    <w:p>
+      <w:pPr>
+        <w:spacing w:after="120"/>
+      </w:pPr>
+      <w:r>
+        <w:rPr>
+          <w:rFonts w:ascii="Arial" w:cs="Arial" w:eastAsia="Arial" w:hAnsi="Arial"/>
+          <w:b/>
+          <w:bCs/>
+          <w:color w:val="B8862B"/>
+          <w:spacing w:val="60"/>
+          <w:sz w:val="20"/>
+          <w:szCs w:val="20"/>
+        </w:rPr>
+        <w:t xml:space="preserve">ПРИЛОЖЕНИЕ</w:t>
+      </w:r>
+    </w:p>
+    <w:p>
+      <w:pPr>
+        <w:spacing w:after="160" w:line="320"/>
+      </w:pPr>
+      <w:r>
+        <w:rPr>
+          <w:rFonts w:ascii="Arial" w:cs="Arial" w:eastAsia="Arial" w:hAnsi="Arial"/>
+          <w:b/>
+          <w:bCs/>
+          <w:color w:val="16181B"/>
+          <w:sz w:val="40"/>
+          <w:szCs w:val="40"/>
+        </w:rPr>
+        <w:t xml:space="preserve">Что нужно для запуска сайта</w:t>
+      </w:r>
+    </w:p>
+    <w:p>
+      <w:pPr>
+        <w:pBdr>
+          <w:left w:val="single" w:color="B8862B" w:sz="18" w:space="8"/>
+        </w:pBdr>
+        <w:shd w:fill="FBF3E2" w:color="auto" w:val="clear"/>
+        <w:spacing w:after="200" w:before="120"/>
+        <w:ind w:left="160"/>
+      </w:pPr>
+      <w:r>
+        <w:rPr>
+          <w:rFonts w:ascii="Arial" w:cs="Arial" w:eastAsia="Arial" w:hAnsi="Arial"/>
+          <w:i/>
+          <w:iCs/>
+          <w:color w:val="5D636C"/>
+          <w:sz w:val="20"/>
+          <w:szCs w:val="20"/>
+        </w:rPr>
+        <w:t xml:space="preserve">Чем полнее материалы, тем быстрее запуск. Пункты с пометкой «обязательно» нужны до старта работ.</w:t>
+      </w:r>
+    </w:p>
+    <w:p>
+      <w:pPr>
+        <w:pStyle w:val="Heading1"/>
+        <w:keepNext/>
+        <w:pBdr>
+          <w:bottom w:val="single" w:color="B8862B" w:sz="6" w:space="4"/>
+        </w:pBdr>
+        <w:spacing w:after="160" w:before="360"/>
+      </w:pPr>
+      <w:r>
+        <w:rPr>
+          <w:rFonts w:ascii="Arial" w:cs="Arial" w:eastAsia="Arial" w:hAnsi="Arial"/>
+          <w:b/>
+          <w:bCs/>
+          <w:color w:val="16181B"/>
+          <w:sz w:val="30"/>
+          <w:szCs w:val="30"/>
+        </w:rPr>
+        <w:t xml:space="preserve">1. Бренд</w:t>
+      </w:r>
+    </w:p>
+    <w:p>
+      <w:pPr>
+        <w:pStyle w:val="ListParagraph"/>
+        <w:numPr>
+          <w:ilvl w:val="0"/>
+          <w:numId w:val="2"/>
+        </w:numPr>
+        <w:spacing w:after="80" w:line="290"/>
+      </w:pPr>
+      <w:r>
+        <w:rPr>
+          <w:rFonts w:ascii="Arial" w:cs="Arial" w:eastAsia="Arial" w:hAnsi="Arial"/>
+        </w:rPr>
+        <w:t xml:space="preserve">Логотип в векторе (SVG, AI, PDF или CDR). Сейчас есть только аватар из Instagram.</w:t>
+      </w:r>
+      <w:r>
+        <w:rPr>
+          <w:rFonts w:ascii="Arial" w:cs="Arial" w:eastAsia="Arial" w:hAnsi="Arial"/>
+          <w:b/>
+          <w:bCs/>
+          <w:color w:val="B8862B"/>
+          <w:sz w:val="16"/>
+          <w:szCs w:val="16"/>
+        </w:rPr>
+        <w:t xml:space="preserve">  обязательно</w:t>
+      </w:r>
+    </w:p>
+    <w:p>
+      <w:pPr>
+        <w:pStyle w:val="ListParagraph"/>
+        <w:numPr>
+          <w:ilvl w:val="0"/>
+          <w:numId w:val="2"/>
+        </w:numPr>
+        <w:spacing w:after="80" w:line="290"/>
+      </w:pPr>
+      <w:r>
+        <w:rPr>
+          <w:rFonts w:ascii="Arial" w:cs="Arial" w:eastAsia="Arial" w:hAnsi="Arial"/>
+        </w:rPr>
+        <w:t xml:space="preserve">Фирменные цвета, если есть брендбук. Если нет — используем графит и золото с логотипа.</w:t>
+      </w:r>
+    </w:p>
+    <w:p>
+      <w:pPr>
+        <w:pStyle w:val="Heading1"/>
+        <w:keepNext/>
+        <w:pBdr>
+          <w:bottom w:val="single" w:color="B8862B" w:sz="6" w:space="4"/>
+        </w:pBdr>
+        <w:spacing w:after="160" w:before="360"/>
+      </w:pPr>
+      <w:r>
+        <w:rPr>
+          <w:rFonts w:ascii="Arial" w:cs="Arial" w:eastAsia="Arial" w:hAnsi="Arial"/>
+          <w:b/>
+          <w:bCs/>
+          <w:color w:val="16181B"/>
+          <w:sz w:val="30"/>
+          <w:szCs w:val="30"/>
+        </w:rPr>
+        <w:t xml:space="preserve">2. Контакты</w:t>
+      </w:r>
+    </w:p>
+    <w:p>
+      <w:pPr>
+        <w:pStyle w:val="ListParagraph"/>
+        <w:numPr>
+          <w:ilvl w:val="0"/>
+          <w:numId w:val="2"/>
+        </w:numPr>
+        <w:spacing w:after="80" w:line="290"/>
+      </w:pPr>
+      <w:r>
+        <w:rPr>
+          <w:rFonts w:ascii="Arial" w:cs="Arial" w:eastAsia="Arial" w:hAnsi="Arial"/>
+        </w:rPr>
+        <w:t xml:space="preserve">Телефоны для сайта (1–2 номера).</w:t>
+      </w:r>
+      <w:r>
+        <w:rPr>
+          <w:rFonts w:ascii="Arial" w:cs="Arial" w:eastAsia="Arial" w:hAnsi="Arial"/>
+          <w:b/>
+          <w:bCs/>
+          <w:color w:val="B8862B"/>
+          <w:sz w:val="16"/>
+          <w:szCs w:val="16"/>
+        </w:rPr>
+        <w:t xml:space="preserve">  обязательно</w:t>
+      </w:r>
+    </w:p>
+    <w:p>
+      <w:pPr>
+        <w:pStyle w:val="ListParagraph"/>
+        <w:numPr>
+          <w:ilvl w:val="0"/>
+          <w:numId w:val="2"/>
+        </w:numPr>
+        <w:spacing w:after="80" w:line="290"/>
+      </w:pPr>
+      <w:r>
+        <w:rPr>
+          <w:rFonts w:ascii="Arial" w:cs="Arial" w:eastAsia="Arial" w:hAnsi="Arial"/>
+        </w:rPr>
+        <w:t xml:space="preserve">Номер WhatsApp для кнопки «Написать» на сайте.</w:t>
+      </w:r>
+      <w:r>
+        <w:rPr>
+          <w:rFonts w:ascii="Arial" w:cs="Arial" w:eastAsia="Arial" w:hAnsi="Arial"/>
+          <w:b/>
+          <w:bCs/>
+          <w:color w:val="B8862B"/>
+          <w:sz w:val="16"/>
+          <w:szCs w:val="16"/>
+        </w:rPr>
+        <w:t xml:space="preserve">  обязательно</w:t>
+      </w:r>
+    </w:p>
+    <w:p>
+      <w:pPr>
+        <w:pStyle w:val="ListParagraph"/>
+        <w:numPr>
+          <w:ilvl w:val="0"/>
+          <w:numId w:val="2"/>
+        </w:numPr>
+        <w:spacing w:after="80" w:line="290"/>
+      </w:pPr>
+      <w:r>
+        <w:rPr>
+          <w:rFonts w:ascii="Arial" w:cs="Arial" w:eastAsia="Arial" w:hAnsi="Arial"/>
+        </w:rPr>
+        <w:t xml:space="preserve">Номера WhatsApp менеджеров, которым будут приходить заявки (1–5 номеров).</w:t>
+      </w:r>
+      <w:r>
+        <w:rPr>
+          <w:rFonts w:ascii="Arial" w:cs="Arial" w:eastAsia="Arial" w:hAnsi="Arial"/>
+          <w:b/>
+          <w:bCs/>
+          <w:color w:val="B8862B"/>
+          <w:sz w:val="16"/>
+          <w:szCs w:val="16"/>
+        </w:rPr>
+        <w:t xml:space="preserve">  обязательно</w:t>
+      </w:r>
+    </w:p>
+    <w:p>
+      <w:pPr>
+        <w:pStyle w:val="ListParagraph"/>
+        <w:numPr>
+          <w:ilvl w:val="0"/>
+          <w:numId w:val="2"/>
+        </w:numPr>
+        <w:spacing w:after="80" w:line="290"/>
+      </w:pPr>
+      <w:r>
+        <w:rPr>
+          <w:rFonts w:ascii="Arial" w:cs="Arial" w:eastAsia="Arial" w:hAnsi="Arial"/>
+        </w:rPr>
+        <w:t xml:space="preserve">Адрес офиса, производства или шоурума и часы работы.</w:t>
+      </w:r>
+      <w:r>
+        <w:rPr>
+          <w:rFonts w:ascii="Arial" w:cs="Arial" w:eastAsia="Arial" w:hAnsi="Arial"/>
+          <w:b/>
+          <w:bCs/>
+          <w:color w:val="B8862B"/>
+          <w:sz w:val="16"/>
+          <w:szCs w:val="16"/>
+        </w:rPr>
+        <w:t xml:space="preserve">  обязательно</w:t>
+      </w:r>
+    </w:p>
+    <w:p>
+      <w:pPr>
+        <w:pStyle w:val="ListParagraph"/>
+        <w:numPr>
+          <w:ilvl w:val="0"/>
+          <w:numId w:val="2"/>
+        </w:numPr>
+        <w:spacing w:after="80" w:line="290"/>
+      </w:pPr>
+      <w:r>
+        <w:rPr>
+          <w:rFonts w:ascii="Arial" w:cs="Arial" w:eastAsia="Arial" w:hAnsi="Arial"/>
+        </w:rPr>
+        <w:t xml:space="preserve">Ссылка на организацию в 2ГИС (для карты и отзывов).</w:t>
+      </w:r>
+    </w:p>
+    <w:p>
+      <w:pPr>
+        <w:pStyle w:val="ListParagraph"/>
+        <w:numPr>
+          <w:ilvl w:val="0"/>
+          <w:numId w:val="2"/>
+        </w:numPr>
+        <w:spacing w:after="80" w:line="290"/>
+      </w:pPr>
+      <w:r>
+        <w:rPr>
+          <w:rFonts w:ascii="Arial" w:cs="Arial" w:eastAsia="Arial" w:hAnsi="Arial"/>
+        </w:rPr>
+        <w:t xml:space="preserve">Email.</w:t>
+      </w:r>
+    </w:p>
+    <w:p>
+      <w:pPr>
+        <w:pStyle w:val="ListParagraph"/>
+        <w:numPr>
+          <w:ilvl w:val="0"/>
+          <w:numId w:val="2"/>
+        </w:numPr>
+        <w:spacing w:after="80" w:line="290"/>
+      </w:pPr>
+      <w:r>
+        <w:rPr>
+          <w:rFonts w:ascii="Arial" w:cs="Arial" w:eastAsia="Arial" w:hAnsi="Arial"/>
+        </w:rPr>
+        <w:t xml:space="preserve">Юридическое название компании и БИН — для политики конфиденциальности и подвала сайта.</w:t>
+      </w:r>
+    </w:p>
+    <w:p>
+      <w:pPr>
+        <w:pStyle w:val="Heading1"/>
+        <w:keepNext/>
+        <w:pBdr>
+          <w:bottom w:val="single" w:color="B8862B" w:sz="6" w:space="4"/>
+        </w:pBdr>
+        <w:spacing w:after="160" w:before="360"/>
+      </w:pPr>
+      <w:r>
+        <w:rPr>
+          <w:rFonts w:ascii="Arial" w:cs="Arial" w:eastAsia="Arial" w:hAnsi="Arial"/>
+          <w:b/>
+          <w:bCs/>
+          <w:color w:val="16181B"/>
+          <w:sz w:val="30"/>
+          <w:szCs w:val="30"/>
+        </w:rPr>
+        <w:t xml:space="preserve">3. Фото и видео</w:t>
+      </w:r>
+    </w:p>
+    <w:p>
+      <w:pPr>
+        <w:spacing w:after="120" w:line="300"/>
+      </w:pPr>
+      <w:r>
+        <w:rPr>
+          <w:rFonts w:ascii="Arial" w:cs="Arial" w:eastAsia="Arial" w:hAnsi="Arial"/>
+          <w:color w:val="5D636C"/>
+        </w:rPr>
+        <w:t xml:space="preserve">Самое важное для продаж: клиенты выбирают по фото выполненных объектов.</w:t>
+      </w:r>
+    </w:p>
+    <w:p>
+      <w:pPr>
+        <w:pStyle w:val="ListParagraph"/>
+        <w:numPr>
+          <w:ilvl w:val="0"/>
+          <w:numId w:val="2"/>
+        </w:numPr>
+        <w:spacing w:after="80" w:line="290"/>
+      </w:pPr>
+      <w:r>
+        <w:rPr>
+          <w:rFonts w:ascii="Arial" w:cs="Arial" w:eastAsia="Arial" w:hAnsi="Arial"/>
+          <w:b/>
+          <w:bCs/>
+        </w:rPr>
+        <w:t xml:space="preserve">Фото готовых объектов: </w:t>
+      </w:r>
+      <w:r>
+        <w:rPr>
+          <w:rFonts w:ascii="Arial" w:cs="Arial" w:eastAsia="Arial" w:hAnsi="Arial"/>
+        </w:rPr>
+        <w:t xml:space="preserve">минимум 8–10 объектов, по 2–5 фото на каждый.</w:t>
+      </w:r>
+      <w:r>
+        <w:rPr>
+          <w:rFonts w:ascii="Arial" w:cs="Arial" w:eastAsia="Arial" w:hAnsi="Arial"/>
+          <w:b/>
+          <w:bCs/>
+          <w:color w:val="B8862B"/>
+          <w:sz w:val="16"/>
+          <w:szCs w:val="16"/>
+        </w:rPr>
+        <w:t xml:space="preserve">  обязательно</w:t>
+      </w:r>
+    </w:p>
+    <w:p>
+      <w:pPr>
+        <w:pStyle w:val="ListParagraph"/>
+        <w:numPr>
+          <w:ilvl w:val="0"/>
+          <w:numId w:val="2"/>
+        </w:numPr>
+        <w:spacing w:after="80" w:line="290"/>
+      </w:pPr>
+      <w:r>
+        <w:rPr>
+          <w:rFonts w:ascii="Arial" w:cs="Arial" w:eastAsia="Arial" w:hAnsi="Arial"/>
+        </w:rPr>
+        <w:t xml:space="preserve">Исходники с телефона или фотоаппарата в максимальном качестве, не скриншоты из Instagram.</w:t>
+      </w:r>
+    </w:p>
+    <w:p>
+      <w:pPr>
+        <w:pStyle w:val="ListParagraph"/>
+        <w:numPr>
+          <w:ilvl w:val="0"/>
+          <w:numId w:val="2"/>
+        </w:numPr>
+        <w:spacing w:after="80" w:line="290"/>
+      </w:pPr>
+      <w:r>
+        <w:rPr>
+          <w:rFonts w:ascii="Arial" w:cs="Arial" w:eastAsia="Arial" w:hAnsi="Arial"/>
+        </w:rPr>
+        <w:t xml:space="preserve">Без надписей и стикеров поверх фото — на сайте текст выводится отдельно.</w:t>
+      </w:r>
+    </w:p>
+    <w:p>
+      <w:pPr>
+        <w:pStyle w:val="ListParagraph"/>
+        <w:numPr>
+          <w:ilvl w:val="0"/>
+          <w:numId w:val="2"/>
+        </w:numPr>
+        <w:spacing w:after="80" w:line="290"/>
+      </w:pPr>
+      <w:r>
+        <w:rPr>
+          <w:rFonts w:ascii="Arial" w:cs="Arial" w:eastAsia="Arial" w:hAnsi="Arial"/>
+        </w:rPr>
+        <w:t xml:space="preserve">Горизонтальные и вертикальные, днём, при хорошем свете.</w:t>
+      </w:r>
+    </w:p>
+    <w:p>
+      <w:pPr>
+        <w:pStyle w:val="ListParagraph"/>
+        <w:numPr>
+          <w:ilvl w:val="0"/>
+          <w:numId w:val="2"/>
+        </w:numPr>
+        <w:spacing w:after="80" w:line="290"/>
+      </w:pPr>
+      <w:r>
+        <w:rPr>
+          <w:rFonts w:ascii="Arial" w:cs="Arial" w:eastAsia="Arial" w:hAnsi="Arial"/>
+        </w:rPr>
+        <w:t xml:space="preserve">По каждому объекту: тип (офис, ТЦ, дом), город, год, что сделали (например, «120 м² перегородок»).</w:t>
+      </w:r>
+    </w:p>
+    <w:p>
+      <w:pPr>
+        <w:pStyle w:val="ListParagraph"/>
+        <w:numPr>
+          <w:ilvl w:val="0"/>
+          <w:numId w:val="2"/>
+        </w:numPr>
+        <w:spacing w:after="80" w:line="290"/>
+      </w:pPr>
+      <w:r>
+        <w:rPr>
+          <w:rFonts w:ascii="Arial" w:cs="Arial" w:eastAsia="Arial" w:hAnsi="Arial"/>
+        </w:rPr>
+        <w:t xml:space="preserve">Фото производства, команды, замерщика на объекте — повышают доверие.</w:t>
+      </w:r>
+    </w:p>
+    <w:p>
+      <w:pPr>
+        <w:pStyle w:val="ListParagraph"/>
+        <w:numPr>
+          <w:ilvl w:val="0"/>
+          <w:numId w:val="2"/>
+        </w:numPr>
+        <w:spacing w:after="80" w:line="290"/>
+      </w:pPr>
+      <w:r>
+        <w:rPr>
+          <w:rFonts w:ascii="Arial" w:cs="Arial" w:eastAsia="Arial" w:hAnsi="Arial"/>
+        </w:rPr>
+        <w:t xml:space="preserve">Видео с объектов — по желанию.</w:t>
+      </w:r>
+    </w:p>
+    <w:p>
+      <w:pPr>
+        <w:pStyle w:val="Heading1"/>
+        <w:keepNext/>
+        <w:pBdr>
+          <w:bottom w:val="single" w:color="B8862B" w:sz="6" w:space="4"/>
+        </w:pBdr>
+        <w:spacing w:after="160" w:before="360"/>
+      </w:pPr>
+      <w:r>
+        <w:rPr>
+          <w:rFonts w:ascii="Arial" w:cs="Arial" w:eastAsia="Arial" w:hAnsi="Arial"/>
+          <w:b/>
+          <w:bCs/>
+          <w:color w:val="16181B"/>
+          <w:sz w:val="30"/>
+          <w:szCs w:val="30"/>
+        </w:rPr>
+        <w:t xml:space="preserve">4. Каталог и цены</w:t>
+      </w:r>
+    </w:p>
+    <w:p>
+      <w:pPr>
+        <w:spacing w:after="120" w:line="300"/>
+      </w:pPr>
+      <w:r>
+        <w:rPr>
+          <w:rFonts w:ascii="Arial" w:cs="Arial" w:eastAsia="Arial" w:hAnsi="Arial"/>
+        </w:rPr>
+        <w:t xml:space="preserve">По каждому направлению (перегородки, витражи, двери, входные группы, окна, раздвижные системы и другие):</w:t>
+      </w:r>
+    </w:p>
+    <w:p>
+      <w:pPr>
+        <w:pStyle w:val="ListParagraph"/>
+        <w:numPr>
+          <w:ilvl w:val="0"/>
+          <w:numId w:val="2"/>
+        </w:numPr>
+        <w:spacing w:after="80" w:line="290"/>
+      </w:pPr>
+      <w:r>
+        <w:rPr>
+          <w:rFonts w:ascii="Arial" w:cs="Arial" w:eastAsia="Arial" w:hAnsi="Arial"/>
+        </w:rPr>
+        <w:t xml:space="preserve">Название и что входит.</w:t>
+      </w:r>
+      <w:r>
+        <w:rPr>
+          <w:rFonts w:ascii="Arial" w:cs="Arial" w:eastAsia="Arial" w:hAnsi="Arial"/>
+          <w:b/>
+          <w:bCs/>
+          <w:color w:val="B8862B"/>
+          <w:sz w:val="16"/>
+          <w:szCs w:val="16"/>
+        </w:rPr>
+        <w:t xml:space="preserve">  обязательно</w:t>
+      </w:r>
+    </w:p>
+    <w:p>
+      <w:pPr>
+        <w:pStyle w:val="ListParagraph"/>
+        <w:numPr>
+          <w:ilvl w:val="0"/>
+          <w:numId w:val="2"/>
+        </w:numPr>
+        <w:spacing w:after="80" w:line="290"/>
+      </w:pPr>
+      <w:r>
+        <w:rPr>
+          <w:rFonts w:ascii="Arial" w:cs="Arial" w:eastAsia="Arial" w:hAnsi="Arial"/>
+        </w:rPr>
+        <w:t xml:space="preserve">Ориентировочная цена «от … ₸/м²» или «от … ₸» — либо решение не показывать цены («цена по замеру»).</w:t>
+      </w:r>
+      <w:r>
+        <w:rPr>
+          <w:rFonts w:ascii="Arial" w:cs="Arial" w:eastAsia="Arial" w:hAnsi="Arial"/>
+          <w:b/>
+          <w:bCs/>
+          <w:color w:val="B8862B"/>
+          <w:sz w:val="16"/>
+          <w:szCs w:val="16"/>
+        </w:rPr>
+        <w:t xml:space="preserve">  обязательно</w:t>
+      </w:r>
+    </w:p>
+    <w:p>
+      <w:pPr>
+        <w:pStyle w:val="ListParagraph"/>
+        <w:numPr>
+          <w:ilvl w:val="0"/>
+          <w:numId w:val="2"/>
+        </w:numPr>
+        <w:spacing w:after="80" w:line="290"/>
+      </w:pPr>
+      <w:r>
+        <w:rPr>
+          <w:rFonts w:ascii="Arial" w:cs="Arial" w:eastAsia="Arial" w:hAnsi="Arial"/>
+        </w:rPr>
+        <w:t xml:space="preserve">Характеристики: профиль, стекло, толщина, фурнитура, цвета, сроки изготовления, гарантия.</w:t>
+      </w:r>
+    </w:p>
+    <w:p>
+      <w:pPr>
+        <w:pStyle w:val="ListParagraph"/>
+        <w:numPr>
+          <w:ilvl w:val="0"/>
+          <w:numId w:val="2"/>
+        </w:numPr>
+        <w:spacing w:after="80" w:line="290"/>
+      </w:pPr>
+      <w:r>
+        <w:rPr>
+          <w:rFonts w:ascii="Arial" w:cs="Arial" w:eastAsia="Arial" w:hAnsi="Arial"/>
+        </w:rPr>
+        <w:t xml:space="preserve">С какими профильными системами работаете (Alutech, Realit, Reynaers, Schüco и т. д.).</w:t>
+      </w:r>
+    </w:p>
+    <w:p>
+      <w:pPr>
+        <w:pStyle w:val="Heading1"/>
+        <w:keepNext/>
+        <w:pBdr>
+          <w:bottom w:val="single" w:color="B8862B" w:sz="6" w:space="4"/>
+        </w:pBdr>
+        <w:spacing w:after="160" w:before="360"/>
+      </w:pPr>
+      <w:r>
+        <w:rPr>
+          <w:rFonts w:ascii="Arial" w:cs="Arial" w:eastAsia="Arial" w:hAnsi="Arial"/>
+          <w:b/>
+          <w:bCs/>
+          <w:color w:val="16181B"/>
+          <w:sz w:val="30"/>
+          <w:szCs w:val="30"/>
+        </w:rPr>
+        <w:t xml:space="preserve">5. Цифры и факты</w:t>
+      </w:r>
+    </w:p>
+    <w:p>
+      <w:pPr>
+        <w:spacing w:after="120" w:line="300"/>
+      </w:pPr>
+      <w:r>
+        <w:rPr>
+          <w:rFonts w:ascii="Arial" w:cs="Arial" w:eastAsia="Arial" w:hAnsi="Arial"/>
+          <w:color w:val="5D636C"/>
+        </w:rPr>
+        <w:t xml:space="preserve">Эти данные есть на сайте — нужно подтвердить или заменить.</w:t>
+      </w:r>
+    </w:p>
+    <w:tbl>
+      <w:tblPr>
+        <w:tblW w:type="dxa" w:w="9638"/>
+        <w:tblBorders>
+          <w:top w:val="single" w:color="auto" w:sz="4"/>
+          <w:left w:val="single" w:color="auto" w:sz="4"/>
+          <w:bottom w:val="single" w:color="auto" w:sz="4"/>
+          <w:right w:val="single" w:color="auto" w:sz="4"/>
+          <w:insideH w:val="single" w:color="auto" w:sz="4"/>
+          <w:insideV w:val="single" w:color="auto" w:sz="4"/>
+        </w:tblBorders>
+      </w:tblPr>
+      <w:tblGrid>
+        <w:gridCol w:w="4800"/>
+        <w:gridCol w:w="4838"/>
+      </w:tblGrid>
+      <w:tr>
+        <w:trPr>
+          <w:cantSplit/>
+          <w:tblHeader/>
+        </w:trPr>
+        <w:tc>
+          <w:tcPr>
+            <w:tcW w:type="dxa" w:w="4800"/>
+            <w:tcBorders>
+              <w:top w:val="single" w:color="DDD7CC" w:sz="4"/>
+              <w:left w:val="single" w:color="DDD7CC" w:sz="4"/>
+              <w:bottom w:val="single" w:color="DDD7CC" w:sz="4"/>
+              <w:right w:val="single" w:color="DDD7CC" w:sz="4"/>
+            </w:tcBorders>
+            <w:shd w:fill="16181B" w:color="auto" w:val="clear"/>
+            <w:tcMar>
+              <w:top w:type="dxa" w:w="100"/>
+              <w:left w:type="dxa" w:w="140"/>
+              <w:bottom w:type="dxa" w:w="100"/>
+              <w:right w:type="dxa" w:w="140"/>
+            </w:tcMar>
+            <w:vAlign w:val="center"/>
+          </w:tcPr>
+          <w:p>
+            <w:pPr>
+              <w:jc w:val="left"/>
+            </w:pPr>
+            <w:r>
+              <w:rPr>
+                <w:rFonts w:ascii="Arial" w:cs="Arial" w:eastAsia="Arial" w:hAnsi="Arial"/>
+                <w:b/>
+                <w:bCs/>
+                <w:color w:val="FFFFFF"/>
+                <w:sz w:val="19"/>
+                <w:szCs w:val="19"/>
+              </w:rPr>
+              <w:t xml:space="preserve">Что</w:t>
+            </w:r>
+          </w:p>
+        </w:tc>
+        <w:tc>
+          <w:tcPr>
+            <w:tcW w:type="dxa" w:w="4838"/>
+            <w:tcBorders>
+              <w:top w:val="single" w:color="DDD7CC" w:sz="4"/>
+              <w:left w:val="single" w:color="DDD7CC" w:sz="4"/>
+              <w:bottom w:val="single" w:color="DDD7CC" w:sz="4"/>
+              <w:right w:val="single" w:color="DDD7CC" w:sz="4"/>
+            </w:tcBorders>
+            <w:shd w:fill="16181B" w:color="auto" w:val="clear"/>
+            <w:tcMar>
+              <w:top w:type="dxa" w:w="100"/>
+              <w:left w:type="dxa" w:w="140"/>
+              <w:bottom w:type="dxa" w:w="100"/>
+              <w:right w:type="dxa" w:w="140"/>
+            </w:tcMar>
+            <w:vAlign w:val="center"/>
+          </w:tcPr>
+          <w:p>
+            <w:pPr>
+              <w:jc w:val="left"/>
+            </w:pPr>
+            <w:r>
+              <w:rPr>
+                <w:rFonts w:ascii="Arial" w:cs="Arial" w:eastAsia="Arial" w:hAnsi="Arial"/>
+                <w:b/>
+                <w:bCs/>
+                <w:color w:val="FFFFFF"/>
+                <w:sz w:val="19"/>
+                <w:szCs w:val="19"/>
+              </w:rPr>
+              <w:t xml:space="preserve">Сейчас на сайте</w:t>
+            </w:r>
+          </w:p>
+        </w:tc>
+      </w:tr>
+      <w:tr>
+        <w:trPr>
+          <w:cantSplit/>
+        </w:trPr>
+        <w:tc>
+          <w:tcPr>
+            <w:tcW w:type="dxa" w:w="4800"/>
+            <w:tcBorders>
+              <w:top w:val="single" w:color="DDD7CC" w:sz="4"/>
+              <w:left w:val="single" w:color="DDD7CC" w:sz="4"/>
+              <w:bottom w:val="single" w:color="DDD7CC" w:sz="4"/>
+              <w:right w:val="single" w:color="DDD7CC" w:sz="4"/>
+            </w:tcBorders>
+            <w:tcMar>
+              <w:top w:type="dxa" w:w="100"/>
+              <w:left w:type="dxa" w:w="140"/>
+              <w:bottom w:type="dxa" w:w="100"/>
+              <w:right w:type="dxa" w:w="140"/>
+            </w:tcMar>
+            <w:vAlign w:val="center"/>
+          </w:tcPr>
+          <w:p>
+            <w:pPr>
+              <w:jc w:val="left"/>
+            </w:pPr>
+            <w:r>
+              <w:rPr>
+                <w:rFonts w:ascii="Arial" w:cs="Arial" w:eastAsia="Arial" w:hAnsi="Arial"/>
+                <w:b w:val="false"/>
+                <w:bCs w:val="false"/>
+                <w:color w:val="16181B"/>
+                <w:sz w:val="20"/>
+                <w:szCs w:val="20"/>
+              </w:rPr>
+              <w:t xml:space="preserve">Лет на рынке (обязательно)</w:t>
+            </w:r>
+          </w:p>
+        </w:tc>
+        <w:tc>
+          <w:tcPr>
+            <w:tcW w:type="dxa" w:w="4838"/>
+            <w:tcBorders>
+              <w:top w:val="single" w:color="DDD7CC" w:sz="4"/>
+              <w:left w:val="single" w:color="DDD7CC" w:sz="4"/>
+              <w:bottom w:val="single" w:color="DDD7CC" w:sz="4"/>
+              <w:right w:val="single" w:color="DDD7CC" w:sz="4"/>
+            </w:tcBorders>
+            <w:tcMar>
+              <w:top w:type="dxa" w:w="100"/>
+              <w:left w:type="dxa" w:w="140"/>
+              <w:bottom w:type="dxa" w:w="100"/>
+              <w:right w:type="dxa" w:w="140"/>
+            </w:tcMar>
+            <w:vAlign w:val="center"/>
+          </w:tcPr>
+          <w:p>
+            <w:pPr>
+              <w:jc w:val="left"/>
+            </w:pPr>
+            <w:r>
+              <w:rPr>
+                <w:rFonts w:ascii="Arial" w:cs="Arial" w:eastAsia="Arial" w:hAnsi="Arial"/>
+                <w:b w:val="false"/>
+                <w:bCs w:val="false"/>
+                <w:color w:val="16181B"/>
+                <w:sz w:val="20"/>
+                <w:szCs w:val="20"/>
+              </w:rPr>
+              <w:t xml:space="preserve">Более 15 лет — из Instagram</w:t>
+            </w:r>
+          </w:p>
+        </w:tc>
+      </w:tr>
+      <w:tr>
+        <w:trPr>
+          <w:cantSplit/>
+        </w:trPr>
+        <w:tc>
+          <w:tcPr>
+            <w:tcW w:type="dxa" w:w="4800"/>
+            <w:tcBorders>
+              <w:top w:val="single" w:color="DDD7CC" w:sz="4"/>
+              <w:left w:val="single" w:color="DDD7CC" w:sz="4"/>
+              <w:bottom w:val="single" w:color="DDD7CC" w:sz="4"/>
+              <w:right w:val="single" w:color="DDD7CC" w:sz="4"/>
+            </w:tcBorders>
+            <w:shd w:fill="F4F2EE" w:color="auto" w:val="clear"/>
+            <w:tcMar>
+              <w:top w:type="dxa" w:w="100"/>
+              <w:left w:type="dxa" w:w="140"/>
+              <w:bottom w:type="dxa" w:w="100"/>
+              <w:right w:type="dxa" w:w="140"/>
+            </w:tcMar>
+            <w:vAlign w:val="center"/>
+          </w:tcPr>
+          <w:p>
+            <w:pPr>
+              <w:jc w:val="left"/>
+            </w:pPr>
+            <w:r>
+              <w:rPr>
+                <w:rFonts w:ascii="Arial" w:cs="Arial" w:eastAsia="Arial" w:hAnsi="Arial"/>
+                <w:b w:val="false"/>
+                <w:bCs w:val="false"/>
+                <w:color w:val="16181B"/>
+                <w:sz w:val="20"/>
+                <w:szCs w:val="20"/>
+              </w:rPr>
+              <w:t xml:space="preserve">Сколько объектов сделано</w:t>
+            </w:r>
+          </w:p>
+        </w:tc>
+        <w:tc>
+          <w:tcPr>
+            <w:tcW w:type="dxa" w:w="4838"/>
+            <w:tcBorders>
+              <w:top w:val="single" w:color="DDD7CC" w:sz="4"/>
+              <w:left w:val="single" w:color="DDD7CC" w:sz="4"/>
+              <w:bottom w:val="single" w:color="DDD7CC" w:sz="4"/>
+              <w:right w:val="single" w:color="DDD7CC" w:sz="4"/>
+            </w:tcBorders>
+            <w:shd w:fill="F4F2EE" w:color="auto" w:val="clear"/>
+            <w:tcMar>
+              <w:top w:type="dxa" w:w="100"/>
+              <w:left w:type="dxa" w:w="140"/>
+              <w:bottom w:type="dxa" w:w="100"/>
+              <w:right w:type="dxa" w:w="140"/>
+            </w:tcMar>
+            <w:vAlign w:val="center"/>
+          </w:tcPr>
+          <w:p>
+            <w:pPr>
+              <w:jc w:val="left"/>
+            </w:pPr>
+            <w:r>
+              <w:rPr>
+                <w:rFonts w:ascii="Arial" w:cs="Arial" w:eastAsia="Arial" w:hAnsi="Arial"/>
+                <w:b w:val="false"/>
+                <w:bCs w:val="false"/>
+                <w:color w:val="16181B"/>
+                <w:sz w:val="20"/>
+                <w:szCs w:val="20"/>
+              </w:rPr>
+              <w:t xml:space="preserve">Не указано</w:t>
+            </w:r>
+          </w:p>
+        </w:tc>
+      </w:tr>
+      <w:tr>
+        <w:trPr>
+          <w:cantSplit/>
+        </w:trPr>
+        <w:tc>
+          <w:tcPr>
+            <w:tcW w:type="dxa" w:w="4800"/>
+            <w:tcBorders>
+              <w:top w:val="single" w:color="DDD7CC" w:sz="4"/>
+              <w:left w:val="single" w:color="DDD7CC" w:sz="4"/>
+              <w:bottom w:val="single" w:color="DDD7CC" w:sz="4"/>
+              <w:right w:val="single" w:color="DDD7CC" w:sz="4"/>
+            </w:tcBorders>
+            <w:tcMar>
+              <w:top w:type="dxa" w:w="100"/>
+              <w:left w:type="dxa" w:w="140"/>
+              <w:bottom w:type="dxa" w:w="100"/>
+              <w:right w:type="dxa" w:w="140"/>
+            </w:tcMar>
+            <w:vAlign w:val="center"/>
+          </w:tcPr>
+          <w:p>
+            <w:pPr>
+              <w:jc w:val="left"/>
+            </w:pPr>
+            <w:r>
+              <w:rPr>
+                <w:rFonts w:ascii="Arial" w:cs="Arial" w:eastAsia="Arial" w:hAnsi="Arial"/>
+                <w:b w:val="false"/>
+                <w:bCs w:val="false"/>
+                <w:color w:val="16181B"/>
+                <w:sz w:val="20"/>
+                <w:szCs w:val="20"/>
+              </w:rPr>
+              <w:t xml:space="preserve">Гарантия на конструкции и монтаж</w:t>
+            </w:r>
+          </w:p>
+        </w:tc>
+        <w:tc>
+          <w:tcPr>
+            <w:tcW w:type="dxa" w:w="4838"/>
+            <w:tcBorders>
+              <w:top w:val="single" w:color="DDD7CC" w:sz="4"/>
+              <w:left w:val="single" w:color="DDD7CC" w:sz="4"/>
+              <w:bottom w:val="single" w:color="DDD7CC" w:sz="4"/>
+              <w:right w:val="single" w:color="DDD7CC" w:sz="4"/>
+            </w:tcBorders>
+            <w:tcMar>
+              <w:top w:type="dxa" w:w="100"/>
+              <w:left w:type="dxa" w:w="140"/>
+              <w:bottom w:type="dxa" w:w="100"/>
+              <w:right w:type="dxa" w:w="140"/>
+            </w:tcMar>
+            <w:vAlign w:val="center"/>
+          </w:tcPr>
+          <w:p>
+            <w:pPr>
+              <w:jc w:val="left"/>
+            </w:pPr>
+            <w:r>
+              <w:rPr>
+                <w:rFonts w:ascii="Arial" w:cs="Arial" w:eastAsia="Arial" w:hAnsi="Arial"/>
+                <w:b w:val="false"/>
+                <w:bCs w:val="false"/>
+                <w:color w:val="16181B"/>
+                <w:sz w:val="20"/>
+                <w:szCs w:val="20"/>
+              </w:rPr>
+              <w:t xml:space="preserve">5 лет — заглушка</w:t>
+            </w:r>
+          </w:p>
+        </w:tc>
+      </w:tr>
+      <w:tr>
+        <w:trPr>
+          <w:cantSplit/>
+        </w:trPr>
+        <w:tc>
+          <w:tcPr>
+            <w:tcW w:type="dxa" w:w="4800"/>
+            <w:tcBorders>
+              <w:top w:val="single" w:color="DDD7CC" w:sz="4"/>
+              <w:left w:val="single" w:color="DDD7CC" w:sz="4"/>
+              <w:bottom w:val="single" w:color="DDD7CC" w:sz="4"/>
+              <w:right w:val="single" w:color="DDD7CC" w:sz="4"/>
+            </w:tcBorders>
+            <w:shd w:fill="F4F2EE" w:color="auto" w:val="clear"/>
+            <w:tcMar>
+              <w:top w:type="dxa" w:w="100"/>
+              <w:left w:type="dxa" w:w="140"/>
+              <w:bottom w:type="dxa" w:w="100"/>
+              <w:right w:type="dxa" w:w="140"/>
+            </w:tcMar>
+            <w:vAlign w:val="center"/>
+          </w:tcPr>
+          <w:p>
+            <w:pPr>
+              <w:jc w:val="left"/>
+            </w:pPr>
+            <w:r>
+              <w:rPr>
+                <w:rFonts w:ascii="Arial" w:cs="Arial" w:eastAsia="Arial" w:hAnsi="Arial"/>
+                <w:b w:val="false"/>
+                <w:bCs w:val="false"/>
+                <w:color w:val="16181B"/>
+                <w:sz w:val="20"/>
+                <w:szCs w:val="20"/>
+              </w:rPr>
+              <w:t xml:space="preserve">Сроки изготовления</w:t>
+            </w:r>
+          </w:p>
+        </w:tc>
+        <w:tc>
+          <w:tcPr>
+            <w:tcW w:type="dxa" w:w="4838"/>
+            <w:tcBorders>
+              <w:top w:val="single" w:color="DDD7CC" w:sz="4"/>
+              <w:left w:val="single" w:color="DDD7CC" w:sz="4"/>
+              <w:bottom w:val="single" w:color="DDD7CC" w:sz="4"/>
+              <w:right w:val="single" w:color="DDD7CC" w:sz="4"/>
+            </w:tcBorders>
+            <w:shd w:fill="F4F2EE" w:color="auto" w:val="clear"/>
+            <w:tcMar>
+              <w:top w:type="dxa" w:w="100"/>
+              <w:left w:type="dxa" w:w="140"/>
+              <w:bottom w:type="dxa" w:w="100"/>
+              <w:right w:type="dxa" w:w="140"/>
+            </w:tcMar>
+            <w:vAlign w:val="center"/>
+          </w:tcPr>
+          <w:p>
+            <w:pPr>
+              <w:jc w:val="left"/>
+            </w:pPr>
+            <w:r>
+              <w:rPr>
+                <w:rFonts w:ascii="Arial" w:cs="Arial" w:eastAsia="Arial" w:hAnsi="Arial"/>
+                <w:b w:val="false"/>
+                <w:bCs w:val="false"/>
+                <w:color w:val="16181B"/>
+                <w:sz w:val="20"/>
+                <w:szCs w:val="20"/>
+              </w:rPr>
+              <w:t xml:space="preserve">От 10 рабочих дней — заглушка</w:t>
+            </w:r>
+          </w:p>
+        </w:tc>
+      </w:tr>
+      <w:tr>
+        <w:trPr>
+          <w:cantSplit/>
+        </w:trPr>
+        <w:tc>
+          <w:tcPr>
+            <w:tcW w:type="dxa" w:w="4800"/>
+            <w:tcBorders>
+              <w:top w:val="single" w:color="DDD7CC" w:sz="4"/>
+              <w:left w:val="single" w:color="DDD7CC" w:sz="4"/>
+              <w:bottom w:val="single" w:color="DDD7CC" w:sz="4"/>
+              <w:right w:val="single" w:color="DDD7CC" w:sz="4"/>
+            </w:tcBorders>
+            <w:tcMar>
+              <w:top w:type="dxa" w:w="100"/>
+              <w:left w:type="dxa" w:w="140"/>
+              <w:bottom w:type="dxa" w:w="100"/>
+              <w:right w:type="dxa" w:w="140"/>
+            </w:tcMar>
+            <w:vAlign w:val="center"/>
+          </w:tcPr>
+          <w:p>
+            <w:pPr>
+              <w:jc w:val="left"/>
+            </w:pPr>
+            <w:r>
+              <w:rPr>
+                <w:rFonts w:ascii="Arial" w:cs="Arial" w:eastAsia="Arial" w:hAnsi="Arial"/>
+                <w:b w:val="false"/>
+                <w:bCs w:val="false"/>
+                <w:color w:val="16181B"/>
+                <w:sz w:val="20"/>
+                <w:szCs w:val="20"/>
+              </w:rPr>
+              <w:t xml:space="preserve">Условия оплаты: предоплата, рассрочка, НДС</w:t>
+            </w:r>
+          </w:p>
+        </w:tc>
+        <w:tc>
+          <w:tcPr>
+            <w:tcW w:type="dxa" w:w="4838"/>
+            <w:tcBorders>
+              <w:top w:val="single" w:color="DDD7CC" w:sz="4"/>
+              <w:left w:val="single" w:color="DDD7CC" w:sz="4"/>
+              <w:bottom w:val="single" w:color="DDD7CC" w:sz="4"/>
+              <w:right w:val="single" w:color="DDD7CC" w:sz="4"/>
+            </w:tcBorders>
+            <w:tcMar>
+              <w:top w:type="dxa" w:w="100"/>
+              <w:left w:type="dxa" w:w="140"/>
+              <w:bottom w:type="dxa" w:w="100"/>
+              <w:right w:type="dxa" w:w="140"/>
+            </w:tcMar>
+            <w:vAlign w:val="center"/>
+          </w:tcPr>
+          <w:p>
+            <w:pPr>
+              <w:jc w:val="left"/>
+            </w:pPr>
+            <w:r>
+              <w:rPr>
+                <w:rFonts w:ascii="Arial" w:cs="Arial" w:eastAsia="Arial" w:hAnsi="Arial"/>
+                <w:b w:val="false"/>
+                <w:bCs w:val="false"/>
+                <w:color w:val="16181B"/>
+                <w:sz w:val="20"/>
+                <w:szCs w:val="20"/>
+              </w:rPr>
+              <w:t xml:space="preserve">Предоплата, остаток после монтажа — заглушка</w:t>
+            </w:r>
+          </w:p>
+        </w:tc>
+      </w:tr>
+      <w:tr>
+        <w:trPr>
+          <w:cantSplit/>
+        </w:trPr>
+        <w:tc>
+          <w:tcPr>
+            <w:tcW w:type="dxa" w:w="4800"/>
+            <w:tcBorders>
+              <w:top w:val="single" w:color="DDD7CC" w:sz="4"/>
+              <w:left w:val="single" w:color="DDD7CC" w:sz="4"/>
+              <w:bottom w:val="single" w:color="DDD7CC" w:sz="4"/>
+              <w:right w:val="single" w:color="DDD7CC" w:sz="4"/>
+            </w:tcBorders>
+            <w:shd w:fill="F4F2EE" w:color="auto" w:val="clear"/>
+            <w:tcMar>
+              <w:top w:type="dxa" w:w="100"/>
+              <w:left w:type="dxa" w:w="140"/>
+              <w:bottom w:type="dxa" w:w="100"/>
+              <w:right w:type="dxa" w:w="140"/>
+            </w:tcMar>
+            <w:vAlign w:val="center"/>
+          </w:tcPr>
+          <w:p>
+            <w:pPr>
+              <w:jc w:val="left"/>
+            </w:pPr>
+            <w:r>
+              <w:rPr>
+                <w:rFonts w:ascii="Arial" w:cs="Arial" w:eastAsia="Arial" w:hAnsi="Arial"/>
+                <w:b w:val="false"/>
+                <w:bCs w:val="false"/>
+                <w:color w:val="16181B"/>
+                <w:sz w:val="20"/>
+                <w:szCs w:val="20"/>
+              </w:rPr>
+              <w:t xml:space="preserve">География работ</w:t>
+            </w:r>
+          </w:p>
+        </w:tc>
+        <w:tc>
+          <w:tcPr>
+            <w:tcW w:type="dxa" w:w="4838"/>
+            <w:tcBorders>
+              <w:top w:val="single" w:color="DDD7CC" w:sz="4"/>
+              <w:left w:val="single" w:color="DDD7CC" w:sz="4"/>
+              <w:bottom w:val="single" w:color="DDD7CC" w:sz="4"/>
+              <w:right w:val="single" w:color="DDD7CC" w:sz="4"/>
+            </w:tcBorders>
+            <w:shd w:fill="F4F2EE" w:color="auto" w:val="clear"/>
+            <w:tcMar>
+              <w:top w:type="dxa" w:w="100"/>
+              <w:left w:type="dxa" w:w="140"/>
+              <w:bottom w:type="dxa" w:w="100"/>
+              <w:right w:type="dxa" w:w="140"/>
+            </w:tcMar>
+            <w:vAlign w:val="center"/>
+          </w:tcPr>
+          <w:p>
+            <w:pPr>
+              <w:jc w:val="left"/>
+            </w:pPr>
+            <w:r>
+              <w:rPr>
+                <w:rFonts w:ascii="Arial" w:cs="Arial" w:eastAsia="Arial" w:hAnsi="Arial"/>
+                <w:b w:val="false"/>
+                <w:bCs w:val="false"/>
+                <w:color w:val="16181B"/>
+                <w:sz w:val="20"/>
+                <w:szCs w:val="20"/>
+              </w:rPr>
+              <w:t xml:space="preserve">Астана и выезд в регионы</w:t>
+            </w:r>
+          </w:p>
+        </w:tc>
+      </w:tr>
+    </w:tbl>
+    <w:p>
+      <w:pPr>
+        <w:pStyle w:val="Heading1"/>
+        <w:keepNext/>
+        <w:pBdr>
+          <w:bottom w:val="single" w:color="B8862B" w:sz="6" w:space="4"/>
+        </w:pBdr>
+        <w:spacing w:after="160" w:before="360"/>
+      </w:pPr>
+      <w:r>
+        <w:rPr>
+          <w:rFonts w:ascii="Arial" w:cs="Arial" w:eastAsia="Arial" w:hAnsi="Arial"/>
+          <w:b/>
+          <w:bCs/>
+          <w:color w:val="16181B"/>
+          <w:sz w:val="30"/>
+          <w:szCs w:val="30"/>
+        </w:rPr>
+        <w:t xml:space="preserve">6. Документы</w:t>
+      </w:r>
+    </w:p>
+    <w:p>
+      <w:pPr>
+        <w:pStyle w:val="ListParagraph"/>
+        <w:numPr>
+          <w:ilvl w:val="0"/>
+          <w:numId w:val="2"/>
+        </w:numPr>
+        <w:spacing w:after="80" w:line="290"/>
+      </w:pPr>
+      <w:r>
+        <w:rPr>
+          <w:rFonts w:ascii="Arial" w:cs="Arial" w:eastAsia="Arial" w:hAnsi="Arial"/>
+        </w:rPr>
+        <w:t xml:space="preserve">Сертификаты соответствия, паспорта качества на стекло и профиль, письма от производителей (сканы PDF или JPG).</w:t>
+      </w:r>
+    </w:p>
+    <w:p>
+      <w:pPr>
+        <w:pStyle w:val="ListParagraph"/>
+        <w:numPr>
+          <w:ilvl w:val="0"/>
+          <w:numId w:val="2"/>
+        </w:numPr>
+        <w:spacing w:after="80" w:line="290"/>
+      </w:pPr>
+      <w:r>
+        <w:rPr>
+          <w:rFonts w:ascii="Arial" w:cs="Arial" w:eastAsia="Arial" w:hAnsi="Arial"/>
+        </w:rPr>
+        <w:t xml:space="preserve">Отзывы клиентов (текст и имя или компания, можно скриншоты) — по желанию.</w:t>
+      </w:r>
+    </w:p>
+    <w:p>
+      <w:pPr>
+        <w:pStyle w:val="Heading1"/>
+        <w:keepNext/>
+        <w:pBdr>
+          <w:bottom w:val="single" w:color="B8862B" w:sz="6" w:space="4"/>
+        </w:pBdr>
+        <w:spacing w:after="160" w:before="360"/>
+      </w:pPr>
+      <w:r>
+        <w:rPr>
+          <w:rFonts w:ascii="Arial" w:cs="Arial" w:eastAsia="Arial" w:hAnsi="Arial"/>
+          <w:b/>
+          <w:bCs/>
+          <w:color w:val="16181B"/>
+          <w:sz w:val="30"/>
+          <w:szCs w:val="30"/>
+        </w:rPr>
+        <w:t xml:space="preserve">7. Доступы и сервисы</w:t>
+      </w:r>
+    </w:p>
+    <w:p>
+      <w:pPr>
+        <w:pStyle w:val="ListParagraph"/>
+        <w:numPr>
+          <w:ilvl w:val="0"/>
+          <w:numId w:val="2"/>
+        </w:numPr>
+        <w:spacing w:after="80" w:line="290"/>
+      </w:pPr>
+      <w:r>
+        <w:rPr>
+          <w:rFonts w:ascii="Arial" w:cs="Arial" w:eastAsia="Arial" w:hAnsi="Arial"/>
+          <w:b/>
+          <w:bCs/>
+        </w:rPr>
+        <w:t xml:space="preserve">Домен. </w:t>
+      </w:r>
+      <w:r>
+        <w:rPr>
+          <w:rFonts w:ascii="Arial" w:cs="Arial" w:eastAsia="Arial" w:hAnsi="Arial"/>
+        </w:rPr>
+        <w:t xml:space="preserve">Адрес alux.kz занят другой компанией (ТОО Atalux). Варианты: alux-kz.kz, aluxglass.kz, alux.com.kz.</w:t>
+      </w:r>
+      <w:r>
+        <w:rPr>
+          <w:rFonts w:ascii="Arial" w:cs="Arial" w:eastAsia="Arial" w:hAnsi="Arial"/>
+          <w:b/>
+          <w:bCs/>
+          <w:color w:val="B8862B"/>
+          <w:sz w:val="16"/>
+          <w:szCs w:val="16"/>
+        </w:rPr>
+        <w:t xml:space="preserve">  обязательно</w:t>
+      </w:r>
+    </w:p>
+    <w:p>
+      <w:pPr>
+        <w:pStyle w:val="ListParagraph"/>
+        <w:numPr>
+          <w:ilvl w:val="0"/>
+          <w:numId w:val="2"/>
+        </w:numPr>
+        <w:spacing w:after="80" w:line="290"/>
+      </w:pPr>
+      <w:r>
+        <w:rPr>
+          <w:rFonts w:ascii="Arial" w:cs="Arial" w:eastAsia="Arial" w:hAnsi="Arial"/>
+          <w:b/>
+          <w:bCs/>
+        </w:rPr>
+        <w:t xml:space="preserve">Сервер (VPS) </w:t>
+      </w:r>
+      <w:r>
+        <w:rPr>
+          <w:rFonts w:ascii="Arial" w:cs="Arial" w:eastAsia="Arial" w:hAnsi="Arial"/>
+        </w:rPr>
+        <w:t xml:space="preserve">— или подберём и оформим на вас: Ubuntu 22.04/24.04, 1–2 vCPU, 2 ГБ RAM, 20 ГБ SSD, желательно дата-центр в Казахстане.</w:t>
+      </w:r>
+      <w:r>
+        <w:rPr>
+          <w:rFonts w:ascii="Arial" w:cs="Arial" w:eastAsia="Arial" w:hAnsi="Arial"/>
+          <w:b/>
+          <w:bCs/>
+          <w:color w:val="B8862B"/>
+          <w:sz w:val="16"/>
+          <w:szCs w:val="16"/>
+        </w:rPr>
+        <w:t xml:space="preserve">  обязательно</w:t>
+      </w:r>
+    </w:p>
+    <w:p>
+      <w:pPr>
+        <w:pStyle w:val="ListParagraph"/>
+        <w:numPr>
+          <w:ilvl w:val="0"/>
+          <w:numId w:val="2"/>
+        </w:numPr>
+        <w:spacing w:after="80" w:line="290"/>
+      </w:pPr>
+      <w:r>
+        <w:rPr>
+          <w:rFonts w:ascii="Arial" w:cs="Arial" w:eastAsia="Arial" w:hAnsi="Arial"/>
+          <w:b/>
+          <w:bCs/>
+        </w:rPr>
+        <w:t xml:space="preserve">WhatsApp для уведомлений: </w:t>
+      </w:r>
+      <w:r>
+        <w:rPr>
+          <w:rFonts w:ascii="Arial" w:cs="Arial" w:eastAsia="Arial" w:hAnsi="Arial"/>
+        </w:rPr>
+        <w:t xml:space="preserve">отдельная сим-карта с WhatsApp (лучше не личный номер). К ней по QR-коду подключается Green API; регистрация и оплата тарифа — на стороне клиента.</w:t>
+      </w:r>
+      <w:r>
+        <w:rPr>
+          <w:rFonts w:ascii="Arial" w:cs="Arial" w:eastAsia="Arial" w:hAnsi="Arial"/>
+          <w:b/>
+          <w:bCs/>
+          <w:color w:val="B8862B"/>
+          <w:sz w:val="16"/>
+          <w:szCs w:val="16"/>
+        </w:rPr>
+        <w:t xml:space="preserve">  обязательно</w:t>
+      </w:r>
+    </w:p>
+    <w:p>
+      <w:pPr>
+        <w:pStyle w:val="ListParagraph"/>
+        <w:numPr>
+          <w:ilvl w:val="0"/>
+          <w:numId w:val="2"/>
+        </w:numPr>
+        <w:spacing w:after="80" w:line="290"/>
+      </w:pPr>
+      <w:r>
+        <w:rPr>
+          <w:rFonts w:ascii="Arial" w:cs="Arial" w:eastAsia="Arial" w:hAnsi="Arial"/>
+        </w:rPr>
+        <w:t xml:space="preserve">Яндекс Метрика и Google Analytics — создадим сами или дайте доступ к существующим.</w:t>
+      </w:r>
+    </w:p>
+    <w:p>
+      <w:pPr>
+        <w:pStyle w:val="ListParagraph"/>
+        <w:numPr>
+          <w:ilvl w:val="0"/>
+          <w:numId w:val="2"/>
+        </w:numPr>
+        <w:spacing w:after="80" w:line="290"/>
+      </w:pPr>
+      <w:r>
+        <w:rPr>
+          <w:rFonts w:ascii="Arial" w:cs="Arial" w:eastAsia="Arial" w:hAnsi="Arial"/>
+        </w:rPr>
+        <w:t xml:space="preserve">Google Search Console и Яндекс Вебмастер — для индексации сайта.</w:t>
+      </w:r>
+    </w:p>
+    <w:p>
+      <w:pPr>
+        <w:pStyle w:val="Heading1"/>
+        <w:keepNext/>
+        <w:pBdr>
+          <w:bottom w:val="single" w:color="B8862B" w:sz="6" w:space="4"/>
+        </w:pBdr>
+        <w:spacing w:after="160" w:before="360"/>
+      </w:pPr>
+      <w:r>
+        <w:rPr>
+          <w:rFonts w:ascii="Arial" w:cs="Arial" w:eastAsia="Arial" w:hAnsi="Arial"/>
+          <w:b/>
+          <w:bCs/>
+          <w:color w:val="16181B"/>
+          <w:sz w:val="30"/>
+          <w:szCs w:val="30"/>
+        </w:rPr>
+        <w:t xml:space="preserve">8. Технические требования к сайту</w:t>
+      </w:r>
+    </w:p>
+    <w:p>
+      <w:pPr>
+        <w:spacing w:after="120" w:line="300"/>
+      </w:pPr>
+      <w:r>
+        <w:rPr>
+          <w:rFonts w:ascii="Arial" w:cs="Arial" w:eastAsia="Arial" w:hAnsi="Arial"/>
+          <w:color w:val="5D636C"/>
+        </w:rPr>
+        <w:t xml:space="preserve">Что мы гарантируем:</w:t>
+      </w:r>
+    </w:p>
+    <w:tbl>
+      <w:tblPr>
+        <w:tblW w:type="dxa" w:w="9638"/>
+        <w:tblBorders>
+          <w:top w:val="single" w:color="auto" w:sz="4"/>
+          <w:left w:val="single" w:color="auto" w:sz="4"/>
+          <w:bottom w:val="single" w:color="auto" w:sz="4"/>
+          <w:right w:val="single" w:color="auto" w:sz="4"/>
+          <w:insideH w:val="single" w:color="auto" w:sz="4"/>
+          <w:insideV w:val="single" w:color="auto" w:sz="4"/>
+        </w:tblBorders>
+      </w:tblPr>
+      <w:tblGrid>
+        <w:gridCol w:w="2800"/>
+        <w:gridCol w:w="6838"/>
+      </w:tblGrid>
+      <w:tr>
+        <w:trPr>
+          <w:cantSplit/>
+          <w:tblHeader/>
+        </w:trPr>
+        <w:tc>
+          <w:tcPr>
+            <w:tcW w:type="dxa" w:w="2800"/>
+            <w:tcBorders>
+              <w:top w:val="single" w:color="DDD7CC" w:sz="4"/>
+              <w:left w:val="single" w:color="DDD7CC" w:sz="4"/>
+              <w:bottom w:val="single" w:color="DDD7CC" w:sz="4"/>
+              <w:right w:val="single" w:color="DDD7CC" w:sz="4"/>
+            </w:tcBorders>
+            <w:shd w:fill="16181B" w:color="auto" w:val="clear"/>
+            <w:tcMar>
+              <w:top w:type="dxa" w:w="100"/>
+              <w:left w:type="dxa" w:w="140"/>
+              <w:bottom w:type="dxa" w:w="100"/>
+              <w:right w:type="dxa" w:w="140"/>
+            </w:tcMar>
+            <w:vAlign w:val="center"/>
+          </w:tcPr>
+          <w:p>
+            <w:pPr>
+              <w:jc w:val="left"/>
+            </w:pPr>
+            <w:r>
+              <w:rPr>
+                <w:rFonts w:ascii="Arial" w:cs="Arial" w:eastAsia="Arial" w:hAnsi="Arial"/>
+                <w:b/>
+                <w:bCs/>
+                <w:color w:val="FFFFFF"/>
+                <w:sz w:val="19"/>
+                <w:szCs w:val="19"/>
+              </w:rPr>
+              <w:t xml:space="preserve">Требование</w:t>
+            </w:r>
+          </w:p>
+        </w:tc>
+        <w:tc>
+          <w:tcPr>
+            <w:tcW w:type="dxa" w:w="6838"/>
+            <w:tcBorders>
+              <w:top w:val="single" w:color="DDD7CC" w:sz="4"/>
+              <w:left w:val="single" w:color="DDD7CC" w:sz="4"/>
+              <w:bottom w:val="single" w:color="DDD7CC" w:sz="4"/>
+              <w:right w:val="single" w:color="DDD7CC" w:sz="4"/>
+            </w:tcBorders>
+            <w:shd w:fill="16181B" w:color="auto" w:val="clear"/>
+            <w:tcMar>
+              <w:top w:type="dxa" w:w="100"/>
+              <w:left w:type="dxa" w:w="140"/>
+              <w:bottom w:type="dxa" w:w="100"/>
+              <w:right w:type="dxa" w:w="140"/>
+            </w:tcMar>
+            <w:vAlign w:val="center"/>
+          </w:tcPr>
+          <w:p>
+            <w:pPr>
+              <w:jc w:val="left"/>
+            </w:pPr>
+            <w:r>
+              <w:rPr>
+                <w:rFonts w:ascii="Arial" w:cs="Arial" w:eastAsia="Arial" w:hAnsi="Arial"/>
+                <w:b/>
+                <w:bCs/>
+                <w:color w:val="FFFFFF"/>
+                <w:sz w:val="19"/>
+                <w:szCs w:val="19"/>
+              </w:rPr>
+              <w:t xml:space="preserve">Реализация</w:t>
+            </w:r>
+          </w:p>
+        </w:tc>
+      </w:tr>
+      <w:tr>
+        <w:trPr>
+          <w:cantSplit/>
+        </w:trPr>
+        <w:tc>
+          <w:tcPr>
+            <w:tcW w:type="dxa" w:w="2800"/>
+            <w:tcBorders>
+              <w:top w:val="single" w:color="DDD7CC" w:sz="4"/>
+              <w:left w:val="single" w:color="DDD7CC" w:sz="4"/>
+              <w:bottom w:val="single" w:color="DDD7CC" w:sz="4"/>
+              <w:right w:val="single" w:color="DDD7CC" w:sz="4"/>
+            </w:tcBorders>
+            <w:tcMar>
+              <w:top w:type="dxa" w:w="100"/>
+              <w:left w:type="dxa" w:w="140"/>
+              <w:bottom w:type="dxa" w:w="100"/>
+              <w:right w:type="dxa" w:w="140"/>
+            </w:tcMar>
+            <w:vAlign w:val="center"/>
+          </w:tcPr>
+          <w:p>
+            <w:pPr>
+              <w:jc w:val="left"/>
+            </w:pPr>
+            <w:r>
+              <w:rPr>
+                <w:rFonts w:ascii="Arial" w:cs="Arial" w:eastAsia="Arial" w:hAnsi="Arial"/>
+                <w:b w:val="false"/>
+                <w:bCs w:val="false"/>
+                <w:color w:val="16181B"/>
+                <w:sz w:val="20"/>
+                <w:szCs w:val="20"/>
+              </w:rPr>
+              <w:t xml:space="preserve">Скорость</w:t>
+            </w:r>
+          </w:p>
+        </w:tc>
+        <w:tc>
+          <w:tcPr>
+            <w:tcW w:type="dxa" w:w="6838"/>
+            <w:tcBorders>
+              <w:top w:val="single" w:color="DDD7CC" w:sz="4"/>
+              <w:left w:val="single" w:color="DDD7CC" w:sz="4"/>
+              <w:bottom w:val="single" w:color="DDD7CC" w:sz="4"/>
+              <w:right w:val="single" w:color="DDD7CC" w:sz="4"/>
+            </w:tcBorders>
+            <w:tcMar>
+              <w:top w:type="dxa" w:w="100"/>
+              <w:left w:type="dxa" w:w="140"/>
+              <w:bottom w:type="dxa" w:w="100"/>
+              <w:right w:type="dxa" w:w="140"/>
+            </w:tcMar>
+            <w:vAlign w:val="center"/>
+          </w:tcPr>
+          <w:p>
+            <w:pPr>
+              <w:jc w:val="left"/>
+            </w:pPr>
+            <w:r>
+              <w:rPr>
+                <w:rFonts w:ascii="Arial" w:cs="Arial" w:eastAsia="Arial" w:hAnsi="Arial"/>
+                <w:b w:val="false"/>
+                <w:bCs w:val="false"/>
+                <w:color w:val="16181B"/>
+                <w:sz w:val="20"/>
+                <w:szCs w:val="20"/>
+              </w:rPr>
+              <w:t xml:space="preserve">Серверный рендеринг, кэш страниц, лёгкие шрифты и изображения</w:t>
+            </w:r>
+          </w:p>
+        </w:tc>
+      </w:tr>
+      <w:tr>
+        <w:trPr>
+          <w:cantSplit/>
+        </w:trPr>
+        <w:tc>
+          <w:tcPr>
+            <w:tcW w:type="dxa" w:w="2800"/>
+            <w:tcBorders>
+              <w:top w:val="single" w:color="DDD7CC" w:sz="4"/>
+              <w:left w:val="single" w:color="DDD7CC" w:sz="4"/>
+              <w:bottom w:val="single" w:color="DDD7CC" w:sz="4"/>
+              <w:right w:val="single" w:color="DDD7CC" w:sz="4"/>
+            </w:tcBorders>
+            <w:shd w:fill="F4F2EE" w:color="auto" w:val="clear"/>
+            <w:tcMar>
+              <w:top w:type="dxa" w:w="100"/>
+              <w:left w:type="dxa" w:w="140"/>
+              <w:bottom w:type="dxa" w:w="100"/>
+              <w:right w:type="dxa" w:w="140"/>
+            </w:tcMar>
+            <w:vAlign w:val="center"/>
+          </w:tcPr>
+          <w:p>
+            <w:pPr>
+              <w:jc w:val="left"/>
+            </w:pPr>
+            <w:r>
+              <w:rPr>
+                <w:rFonts w:ascii="Arial" w:cs="Arial" w:eastAsia="Arial" w:hAnsi="Arial"/>
+                <w:b w:val="false"/>
+                <w:bCs w:val="false"/>
+                <w:color w:val="16181B"/>
+                <w:sz w:val="20"/>
+                <w:szCs w:val="20"/>
+              </w:rPr>
+              <w:t xml:space="preserve">Адаптивность</w:t>
+            </w:r>
+          </w:p>
+        </w:tc>
+        <w:tc>
+          <w:tcPr>
+            <w:tcW w:type="dxa" w:w="6838"/>
+            <w:tcBorders>
+              <w:top w:val="single" w:color="DDD7CC" w:sz="4"/>
+              <w:left w:val="single" w:color="DDD7CC" w:sz="4"/>
+              <w:bottom w:val="single" w:color="DDD7CC" w:sz="4"/>
+              <w:right w:val="single" w:color="DDD7CC" w:sz="4"/>
+            </w:tcBorders>
+            <w:shd w:fill="F4F2EE" w:color="auto" w:val="clear"/>
+            <w:tcMar>
+              <w:top w:type="dxa" w:w="100"/>
+              <w:left w:type="dxa" w:w="140"/>
+              <w:bottom w:type="dxa" w:w="100"/>
+              <w:right w:type="dxa" w:w="140"/>
+            </w:tcMar>
+            <w:vAlign w:val="center"/>
+          </w:tcPr>
+          <w:p>
+            <w:pPr>
+              <w:jc w:val="left"/>
+            </w:pPr>
+            <w:r>
+              <w:rPr>
+                <w:rFonts w:ascii="Arial" w:cs="Arial" w:eastAsia="Arial" w:hAnsi="Arial"/>
+                <w:b w:val="false"/>
+                <w:bCs w:val="false"/>
+                <w:color w:val="16181B"/>
+                <w:sz w:val="20"/>
+                <w:szCs w:val="20"/>
+              </w:rPr>
+              <w:t xml:space="preserve">От 360 до 2560 px; мобильные сценарии: свайп-карусели, мобильное меню</w:t>
+            </w:r>
+          </w:p>
+        </w:tc>
+      </w:tr>
+      <w:tr>
+        <w:trPr>
+          <w:cantSplit/>
+        </w:trPr>
+        <w:tc>
+          <w:tcPr>
+            <w:tcW w:type="dxa" w:w="2800"/>
+            <w:tcBorders>
+              <w:top w:val="single" w:color="DDD7CC" w:sz="4"/>
+              <w:left w:val="single" w:color="DDD7CC" w:sz="4"/>
+              <w:bottom w:val="single" w:color="DDD7CC" w:sz="4"/>
+              <w:right w:val="single" w:color="DDD7CC" w:sz="4"/>
+            </w:tcBorders>
+            <w:tcMar>
+              <w:top w:type="dxa" w:w="100"/>
+              <w:left w:type="dxa" w:w="140"/>
+              <w:bottom w:type="dxa" w:w="100"/>
+              <w:right w:type="dxa" w:w="140"/>
+            </w:tcMar>
+            <w:vAlign w:val="center"/>
+          </w:tcPr>
+          <w:p>
+            <w:pPr>
+              <w:jc w:val="left"/>
+            </w:pPr>
+            <w:r>
+              <w:rPr>
+                <w:rFonts w:ascii="Arial" w:cs="Arial" w:eastAsia="Arial" w:hAnsi="Arial"/>
+                <w:b w:val="false"/>
+                <w:bCs w:val="false"/>
+                <w:color w:val="16181B"/>
+                <w:sz w:val="20"/>
+                <w:szCs w:val="20"/>
+              </w:rPr>
+              <w:t xml:space="preserve">SEO</w:t>
+            </w:r>
+          </w:p>
+        </w:tc>
+        <w:tc>
+          <w:tcPr>
+            <w:tcW w:type="dxa" w:w="6838"/>
+            <w:tcBorders>
+              <w:top w:val="single" w:color="DDD7CC" w:sz="4"/>
+              <w:left w:val="single" w:color="DDD7CC" w:sz="4"/>
+              <w:bottom w:val="single" w:color="DDD7CC" w:sz="4"/>
+              <w:right w:val="single" w:color="DDD7CC" w:sz="4"/>
+            </w:tcBorders>
+            <w:tcMar>
+              <w:top w:type="dxa" w:w="100"/>
+              <w:left w:type="dxa" w:w="140"/>
+              <w:bottom w:type="dxa" w:w="100"/>
+              <w:right w:type="dxa" w:w="140"/>
+            </w:tcMar>
+            <w:vAlign w:val="center"/>
+          </w:tcPr>
+          <w:p>
+            <w:pPr>
+              <w:jc w:val="left"/>
+            </w:pPr>
+            <w:r>
+              <w:rPr>
+                <w:rFonts w:ascii="Arial" w:cs="Arial" w:eastAsia="Arial" w:hAnsi="Arial"/>
+                <w:b w:val="false"/>
+                <w:bCs w:val="false"/>
+                <w:color w:val="16181B"/>
+                <w:sz w:val="20"/>
+                <w:szCs w:val="20"/>
+              </w:rPr>
+              <w:t xml:space="preserve">Мета-теги, canonical, sitemap.xml, robots.txt, микроразметка Schema.org</w:t>
+            </w:r>
+          </w:p>
+        </w:tc>
+      </w:tr>
+      <w:tr>
+        <w:trPr>
+          <w:cantSplit/>
+        </w:trPr>
+        <w:tc>
+          <w:tcPr>
+            <w:tcW w:type="dxa" w:w="2800"/>
+            <w:tcBorders>
+              <w:top w:val="single" w:color="DDD7CC" w:sz="4"/>
+              <w:left w:val="single" w:color="DDD7CC" w:sz="4"/>
+              <w:bottom w:val="single" w:color="DDD7CC" w:sz="4"/>
+              <w:right w:val="single" w:color="DDD7CC" w:sz="4"/>
+            </w:tcBorders>
+            <w:shd w:fill="F4F2EE" w:color="auto" w:val="clear"/>
+            <w:tcMar>
+              <w:top w:type="dxa" w:w="100"/>
+              <w:left w:type="dxa" w:w="140"/>
+              <w:bottom w:type="dxa" w:w="100"/>
+              <w:right w:type="dxa" w:w="140"/>
+            </w:tcMar>
+            <w:vAlign w:val="center"/>
+          </w:tcPr>
+          <w:p>
+            <w:pPr>
+              <w:jc w:val="left"/>
+            </w:pPr>
+            <w:r>
+              <w:rPr>
+                <w:rFonts w:ascii="Arial" w:cs="Arial" w:eastAsia="Arial" w:hAnsi="Arial"/>
+                <w:b w:val="false"/>
+                <w:bCs w:val="false"/>
+                <w:color w:val="16181B"/>
+                <w:sz w:val="20"/>
+                <w:szCs w:val="20"/>
+              </w:rPr>
+              <w:t xml:space="preserve">Заявки</w:t>
+            </w:r>
+          </w:p>
+        </w:tc>
+        <w:tc>
+          <w:tcPr>
+            <w:tcW w:type="dxa" w:w="6838"/>
+            <w:tcBorders>
+              <w:top w:val="single" w:color="DDD7CC" w:sz="4"/>
+              <w:left w:val="single" w:color="DDD7CC" w:sz="4"/>
+              <w:bottom w:val="single" w:color="DDD7CC" w:sz="4"/>
+              <w:right w:val="single" w:color="DDD7CC" w:sz="4"/>
+            </w:tcBorders>
+            <w:shd w:fill="F4F2EE" w:color="auto" w:val="clear"/>
+            <w:tcMar>
+              <w:top w:type="dxa" w:w="100"/>
+              <w:left w:type="dxa" w:w="140"/>
+              <w:bottom w:type="dxa" w:w="100"/>
+              <w:right w:type="dxa" w:w="140"/>
+            </w:tcMar>
+            <w:vAlign w:val="center"/>
+          </w:tcPr>
+          <w:p>
+            <w:pPr>
+              <w:jc w:val="left"/>
+            </w:pPr>
+            <w:r>
+              <w:rPr>
+                <w:rFonts w:ascii="Arial" w:cs="Arial" w:eastAsia="Arial" w:hAnsi="Arial"/>
+                <w:b w:val="false"/>
+                <w:bCs w:val="false"/>
+                <w:color w:val="16181B"/>
+                <w:sz w:val="20"/>
+                <w:szCs w:val="20"/>
+              </w:rPr>
+              <w:t xml:space="preserve">Сохраняются в базе и дублируются в WhatsApp; антиспам; выгрузка в Excel</w:t>
+            </w:r>
+          </w:p>
+        </w:tc>
+      </w:tr>
+      <w:tr>
+        <w:trPr>
+          <w:cantSplit/>
+        </w:trPr>
+        <w:tc>
+          <w:tcPr>
+            <w:tcW w:type="dxa" w:w="2800"/>
+            <w:tcBorders>
+              <w:top w:val="single" w:color="DDD7CC" w:sz="4"/>
+              <w:left w:val="single" w:color="DDD7CC" w:sz="4"/>
+              <w:bottom w:val="single" w:color="DDD7CC" w:sz="4"/>
+              <w:right w:val="single" w:color="DDD7CC" w:sz="4"/>
+            </w:tcBorders>
+            <w:tcMar>
+              <w:top w:type="dxa" w:w="100"/>
+              <w:left w:type="dxa" w:w="140"/>
+              <w:bottom w:type="dxa" w:w="100"/>
+              <w:right w:type="dxa" w:w="140"/>
+            </w:tcMar>
+            <w:vAlign w:val="center"/>
+          </w:tcPr>
+          <w:p>
+            <w:pPr>
+              <w:jc w:val="left"/>
+            </w:pPr>
+            <w:r>
+              <w:rPr>
+                <w:rFonts w:ascii="Arial" w:cs="Arial" w:eastAsia="Arial" w:hAnsi="Arial"/>
+                <w:b w:val="false"/>
+                <w:bCs w:val="false"/>
+                <w:color w:val="16181B"/>
+                <w:sz w:val="20"/>
+                <w:szCs w:val="20"/>
+              </w:rPr>
+              <w:t xml:space="preserve">Управление</w:t>
+            </w:r>
+          </w:p>
+        </w:tc>
+        <w:tc>
+          <w:tcPr>
+            <w:tcW w:type="dxa" w:w="6838"/>
+            <w:tcBorders>
+              <w:top w:val="single" w:color="DDD7CC" w:sz="4"/>
+              <w:left w:val="single" w:color="DDD7CC" w:sz="4"/>
+              <w:bottom w:val="single" w:color="DDD7CC" w:sz="4"/>
+              <w:right w:val="single" w:color="DDD7CC" w:sz="4"/>
+            </w:tcBorders>
+            <w:tcMar>
+              <w:top w:type="dxa" w:w="100"/>
+              <w:left w:type="dxa" w:w="140"/>
+              <w:bottom w:type="dxa" w:w="100"/>
+              <w:right w:type="dxa" w:w="140"/>
+            </w:tcMar>
+            <w:vAlign w:val="center"/>
+          </w:tcPr>
+          <w:p>
+            <w:pPr>
+              <w:jc w:val="left"/>
+            </w:pPr>
+            <w:r>
+              <w:rPr>
+                <w:rFonts w:ascii="Arial" w:cs="Arial" w:eastAsia="Arial" w:hAnsi="Arial"/>
+                <w:b w:val="false"/>
+                <w:bCs w:val="false"/>
+                <w:color w:val="16181B"/>
+                <w:sz w:val="20"/>
+                <w:szCs w:val="20"/>
+              </w:rPr>
+              <w:t xml:space="preserve">Админка для всего контента без программиста</w:t>
+            </w:r>
+          </w:p>
+        </w:tc>
+      </w:tr>
+      <w:tr>
+        <w:trPr>
+          <w:cantSplit/>
+        </w:trPr>
+        <w:tc>
+          <w:tcPr>
+            <w:tcW w:type="dxa" w:w="2800"/>
+            <w:tcBorders>
+              <w:top w:val="single" w:color="DDD7CC" w:sz="4"/>
+              <w:left w:val="single" w:color="DDD7CC" w:sz="4"/>
+              <w:bottom w:val="single" w:color="DDD7CC" w:sz="4"/>
+              <w:right w:val="single" w:color="DDD7CC" w:sz="4"/>
+            </w:tcBorders>
+            <w:shd w:fill="F4F2EE" w:color="auto" w:val="clear"/>
+            <w:tcMar>
+              <w:top w:type="dxa" w:w="100"/>
+              <w:left w:type="dxa" w:w="140"/>
+              <w:bottom w:type="dxa" w:w="100"/>
+              <w:right w:type="dxa" w:w="140"/>
+            </w:tcMar>
+            <w:vAlign w:val="center"/>
+          </w:tcPr>
+          <w:p>
+            <w:pPr>
+              <w:jc w:val="left"/>
+            </w:pPr>
+            <w:r>
+              <w:rPr>
+                <w:rFonts w:ascii="Arial" w:cs="Arial" w:eastAsia="Arial" w:hAnsi="Arial"/>
+                <w:b w:val="false"/>
+                <w:bCs w:val="false"/>
+                <w:color w:val="16181B"/>
+                <w:sz w:val="20"/>
+                <w:szCs w:val="20"/>
+              </w:rPr>
+              <w:t xml:space="preserve">Безопасность</w:t>
+            </w:r>
+          </w:p>
+        </w:tc>
+        <w:tc>
+          <w:tcPr>
+            <w:tcW w:type="dxa" w:w="6838"/>
+            <w:tcBorders>
+              <w:top w:val="single" w:color="DDD7CC" w:sz="4"/>
+              <w:left w:val="single" w:color="DDD7CC" w:sz="4"/>
+              <w:bottom w:val="single" w:color="DDD7CC" w:sz="4"/>
+              <w:right w:val="single" w:color="DDD7CC" w:sz="4"/>
+            </w:tcBorders>
+            <w:shd w:fill="F4F2EE" w:color="auto" w:val="clear"/>
+            <w:tcMar>
+              <w:top w:type="dxa" w:w="100"/>
+              <w:left w:type="dxa" w:w="140"/>
+              <w:bottom w:type="dxa" w:w="100"/>
+              <w:right w:type="dxa" w:w="140"/>
+            </w:tcMar>
+            <w:vAlign w:val="center"/>
+          </w:tcPr>
+          <w:p>
+            <w:pPr>
+              <w:jc w:val="left"/>
+            </w:pPr>
+            <w:r>
+              <w:rPr>
+                <w:rFonts w:ascii="Arial" w:cs="Arial" w:eastAsia="Arial" w:hAnsi="Arial"/>
+                <w:b w:val="false"/>
+                <w:bCs w:val="false"/>
+                <w:color w:val="16181B"/>
+                <w:sz w:val="20"/>
+                <w:szCs w:val="20"/>
+              </w:rPr>
+              <w:t xml:space="preserve">HTTPS, авторизация по токену, защита от подбора пароля, проверка загружаемых файлов</w:t>
+            </w:r>
+          </w:p>
+        </w:tc>
+      </w:tr>
+      <w:tr>
+        <w:trPr>
+          <w:cantSplit/>
+        </w:trPr>
+        <w:tc>
+          <w:tcPr>
+            <w:tcW w:type="dxa" w:w="2800"/>
+            <w:tcBorders>
+              <w:top w:val="single" w:color="DDD7CC" w:sz="4"/>
+              <w:left w:val="single" w:color="DDD7CC" w:sz="4"/>
+              <w:bottom w:val="single" w:color="DDD7CC" w:sz="4"/>
+              <w:right w:val="single" w:color="DDD7CC" w:sz="4"/>
+            </w:tcBorders>
+            <w:tcMar>
+              <w:top w:type="dxa" w:w="100"/>
+              <w:left w:type="dxa" w:w="140"/>
+              <w:bottom w:type="dxa" w:w="100"/>
+              <w:right w:type="dxa" w:w="140"/>
+            </w:tcMar>
+            <w:vAlign w:val="center"/>
+          </w:tcPr>
+          <w:p>
+            <w:pPr>
+              <w:jc w:val="left"/>
+            </w:pPr>
+            <w:r>
+              <w:rPr>
+                <w:rFonts w:ascii="Arial" w:cs="Arial" w:eastAsia="Arial" w:hAnsi="Arial"/>
+                <w:b w:val="false"/>
+                <w:bCs w:val="false"/>
+                <w:color w:val="16181B"/>
+                <w:sz w:val="20"/>
+                <w:szCs w:val="20"/>
+              </w:rPr>
+              <w:t xml:space="preserve">Персональные данные</w:t>
+            </w:r>
+          </w:p>
+        </w:tc>
+        <w:tc>
+          <w:tcPr>
+            <w:tcW w:type="dxa" w:w="6838"/>
+            <w:tcBorders>
+              <w:top w:val="single" w:color="DDD7CC" w:sz="4"/>
+              <w:left w:val="single" w:color="DDD7CC" w:sz="4"/>
+              <w:bottom w:val="single" w:color="DDD7CC" w:sz="4"/>
+              <w:right w:val="single" w:color="DDD7CC" w:sz="4"/>
+            </w:tcBorders>
+            <w:tcMar>
+              <w:top w:type="dxa" w:w="100"/>
+              <w:left w:type="dxa" w:w="140"/>
+              <w:bottom w:type="dxa" w:w="100"/>
+              <w:right w:type="dxa" w:w="140"/>
+            </w:tcMar>
+            <w:vAlign w:val="center"/>
+          </w:tcPr>
+          <w:p>
+            <w:pPr>
+              <w:jc w:val="left"/>
+            </w:pPr>
+            <w:r>
+              <w:rPr>
+                <w:rFonts w:ascii="Arial" w:cs="Arial" w:eastAsia="Arial" w:hAnsi="Arial"/>
+                <w:b w:val="false"/>
+                <w:bCs w:val="false"/>
+                <w:color w:val="16181B"/>
+                <w:sz w:val="20"/>
+                <w:szCs w:val="20"/>
+              </w:rPr>
+              <w:t xml:space="preserve">Согласие в формах, политика обработки ПД по законодательству РК</w:t>
+            </w:r>
+          </w:p>
+        </w:tc>
+      </w:tr>
+      <w:tr>
+        <w:trPr>
+          <w:cantSplit/>
+        </w:trPr>
+        <w:tc>
+          <w:tcPr>
+            <w:tcW w:type="dxa" w:w="2800"/>
+            <w:tcBorders>
+              <w:top w:val="single" w:color="DDD7CC" w:sz="4"/>
+              <w:left w:val="single" w:color="DDD7CC" w:sz="4"/>
+              <w:bottom w:val="single" w:color="DDD7CC" w:sz="4"/>
+              <w:right w:val="single" w:color="DDD7CC" w:sz="4"/>
+            </w:tcBorders>
+            <w:shd w:fill="F4F2EE" w:color="auto" w:val="clear"/>
+            <w:tcMar>
+              <w:top w:type="dxa" w:w="100"/>
+              <w:left w:type="dxa" w:w="140"/>
+              <w:bottom w:type="dxa" w:w="100"/>
+              <w:right w:type="dxa" w:w="140"/>
+            </w:tcMar>
+            <w:vAlign w:val="center"/>
+          </w:tcPr>
+          <w:p>
+            <w:pPr>
+              <w:jc w:val="left"/>
+            </w:pPr>
+            <w:r>
+              <w:rPr>
+                <w:rFonts w:ascii="Arial" w:cs="Arial" w:eastAsia="Arial" w:hAnsi="Arial"/>
+                <w:b w:val="false"/>
+                <w:bCs w:val="false"/>
+                <w:color w:val="16181B"/>
+                <w:sz w:val="20"/>
+                <w:szCs w:val="20"/>
+              </w:rPr>
+              <w:t xml:space="preserve">Резервные копии</w:t>
+            </w:r>
+          </w:p>
+        </w:tc>
+        <w:tc>
+          <w:tcPr>
+            <w:tcW w:type="dxa" w:w="6838"/>
+            <w:tcBorders>
+              <w:top w:val="single" w:color="DDD7CC" w:sz="4"/>
+              <w:left w:val="single" w:color="DDD7CC" w:sz="4"/>
+              <w:bottom w:val="single" w:color="DDD7CC" w:sz="4"/>
+              <w:right w:val="single" w:color="DDD7CC" w:sz="4"/>
+            </w:tcBorders>
+            <w:shd w:fill="F4F2EE" w:color="auto" w:val="clear"/>
+            <w:tcMar>
+              <w:top w:type="dxa" w:w="100"/>
+              <w:left w:type="dxa" w:w="140"/>
+              <w:bottom w:type="dxa" w:w="100"/>
+              <w:right w:type="dxa" w:w="140"/>
+            </w:tcMar>
+            <w:vAlign w:val="center"/>
+          </w:tcPr>
+          <w:p>
+            <w:pPr>
+              <w:jc w:val="left"/>
+            </w:pPr>
+            <w:r>
+              <w:rPr>
+                <w:rFonts w:ascii="Arial" w:cs="Arial" w:eastAsia="Arial" w:hAnsi="Arial"/>
+                <w:b w:val="false"/>
+                <w:bCs w:val="false"/>
+                <w:color w:val="16181B"/>
+                <w:sz w:val="20"/>
+                <w:szCs w:val="20"/>
+              </w:rPr>
+              <w:t xml:space="preserve">Ежедневный бэкап базы и файлов</w:t>
+            </w:r>
+          </w:p>
+        </w:tc>
+      </w:tr>
+      <w:tr>
+        <w:trPr>
+          <w:cantSplit/>
+        </w:trPr>
+        <w:tc>
+          <w:tcPr>
+            <w:tcW w:type="dxa" w:w="2800"/>
+            <w:tcBorders>
+              <w:top w:val="single" w:color="DDD7CC" w:sz="4"/>
+              <w:left w:val="single" w:color="DDD7CC" w:sz="4"/>
+              <w:bottom w:val="single" w:color="DDD7CC" w:sz="4"/>
+              <w:right w:val="single" w:color="DDD7CC" w:sz="4"/>
+            </w:tcBorders>
+            <w:tcMar>
+              <w:top w:type="dxa" w:w="100"/>
+              <w:left w:type="dxa" w:w="140"/>
+              <w:bottom w:type="dxa" w:w="100"/>
+              <w:right w:type="dxa" w:w="140"/>
+            </w:tcMar>
+            <w:vAlign w:val="center"/>
+          </w:tcPr>
+          <w:p>
+            <w:pPr>
+              <w:jc w:val="left"/>
+            </w:pPr>
+            <w:r>
+              <w:rPr>
+                <w:rFonts w:ascii="Arial" w:cs="Arial" w:eastAsia="Arial" w:hAnsi="Arial"/>
+                <w:b w:val="false"/>
+                <w:bCs w:val="false"/>
+                <w:color w:val="16181B"/>
+                <w:sz w:val="20"/>
+                <w:szCs w:val="20"/>
+              </w:rPr>
+              <w:t xml:space="preserve">Браузеры</w:t>
+            </w:r>
+          </w:p>
+        </w:tc>
+        <w:tc>
+          <w:tcPr>
+            <w:tcW w:type="dxa" w:w="6838"/>
+            <w:tcBorders>
+              <w:top w:val="single" w:color="DDD7CC" w:sz="4"/>
+              <w:left w:val="single" w:color="DDD7CC" w:sz="4"/>
+              <w:bottom w:val="single" w:color="DDD7CC" w:sz="4"/>
+              <w:right w:val="single" w:color="DDD7CC" w:sz="4"/>
+            </w:tcBorders>
+            <w:tcMar>
+              <w:top w:type="dxa" w:w="100"/>
+              <w:left w:type="dxa" w:w="140"/>
+              <w:bottom w:type="dxa" w:w="100"/>
+              <w:right w:type="dxa" w:w="140"/>
+            </w:tcMar>
+            <w:vAlign w:val="center"/>
+          </w:tcPr>
+          <w:p>
+            <w:pPr>
+              <w:jc w:val="left"/>
+            </w:pPr>
+            <w:r>
+              <w:rPr>
+                <w:rFonts w:ascii="Arial" w:cs="Arial" w:eastAsia="Arial" w:hAnsi="Arial"/>
+                <w:b w:val="false"/>
+                <w:bCs w:val="false"/>
+                <w:color w:val="16181B"/>
+                <w:sz w:val="20"/>
+                <w:szCs w:val="20"/>
+              </w:rPr>
+              <w:t xml:space="preserve">Последние версии Chrome, Safari (iOS и macOS), Edge, Firefox, Яндекс Браузер</w:t>
             </w:r>
           </w:p>
         </w:tc>

</xml_diff>